<commit_message>
reformulacion de los apartados 8, 9 y 10
</commit_message>
<xml_diff>
--- a/IEI-078-Evaluacion 4 - Proyecto final.docx
+++ b/IEI-078-Evaluacion 4 - Proyecto final.docx
@@ -2034,6 +2034,22 @@
     </w:p>
     <w:p>
       <w:pPr>
+        <w:rPr>
+          <w:rFonts w:ascii="Calibri" w:eastAsia="Times New Roman" w:hAnsi="Calibri" w:cs="Calibri"/>
+          <w:color w:val="0F4761" w:themeColor="accent1" w:themeShade="BF"/>
+          <w:lang w:eastAsia="es-CL"/>
+        </w:rPr>
+      </w:pPr>
+      <w:r>
+        <w:rPr>
+          <w:rFonts w:ascii="Calibri" w:eastAsia="Times New Roman" w:hAnsi="Calibri" w:cs="Calibri"/>
+          <w:lang w:eastAsia="es-CL"/>
+        </w:rPr>
+        <w:br w:type="page"/>
+      </w:r>
+    </w:p>
+    <w:p>
+      <w:pPr>
         <w:pStyle w:val="Ttulo2"/>
         <w:spacing w:before="0" w:after="0" w:line="240" w:lineRule="auto"/>
         <w:rPr>
@@ -2050,6 +2066,7 @@
           <w:szCs w:val="22"/>
           <w:lang w:eastAsia="es-CL"/>
         </w:rPr>
+        <w:lastRenderedPageBreak/>
         <w:t>5</w:t>
       </w:r>
       <w:r>
@@ -2119,7 +2136,6 @@
           <w:lang w:eastAsia="es-CL"/>
           <w14:ligatures w14:val="none"/>
         </w:rPr>
-        <w:lastRenderedPageBreak/>
         <w:t>Justificación central (por qué existe).</w:t>
       </w:r>
     </w:p>
@@ -2240,7 +2256,31 @@
           <w:lang w:eastAsia="es-CL"/>
           <w14:ligatures w14:val="none"/>
         </w:rPr>
-        <w:t>.3 Stakeholders iniciales</w:t>
+        <w:t xml:space="preserve">.3 </w:t>
+      </w:r>
+      <w:proofErr w:type="spellStart"/>
+      <w:r>
+        <w:rPr>
+          <w:rFonts w:ascii="Calibri" w:eastAsia="Times New Roman" w:hAnsi="Calibri" w:cs="Calibri"/>
+          <w:b/>
+          <w:bCs/>
+          <w:kern w:val="0"/>
+          <w:lang w:eastAsia="es-CL"/>
+          <w14:ligatures w14:val="none"/>
+        </w:rPr>
+        <w:t>Stakeholders</w:t>
+      </w:r>
+      <w:proofErr w:type="spellEnd"/>
+      <w:r>
+        <w:rPr>
+          <w:rFonts w:ascii="Calibri" w:eastAsia="Times New Roman" w:hAnsi="Calibri" w:cs="Calibri"/>
+          <w:b/>
+          <w:bCs/>
+          <w:kern w:val="0"/>
+          <w:lang w:eastAsia="es-CL"/>
+          <w14:ligatures w14:val="none"/>
+        </w:rPr>
+        <w:t xml:space="preserve"> iniciales</w:t>
       </w:r>
     </w:p>
     <w:p>
@@ -2566,7 +2606,27 @@
           <w:lang w:eastAsia="es-CL"/>
           <w14:ligatures w14:val="none"/>
         </w:rPr>
-        <w:t>Factores Ambientales de la Empresa (EEFs).</w:t>
+        <w:t>Factores Ambientales de la Empresa (</w:t>
+      </w:r>
+      <w:proofErr w:type="spellStart"/>
+      <w:r>
+        <w:rPr>
+          <w:rFonts w:ascii="Calibri" w:eastAsia="Times New Roman" w:hAnsi="Calibri" w:cs="Calibri"/>
+          <w:kern w:val="0"/>
+          <w:lang w:eastAsia="es-CL"/>
+          <w14:ligatures w14:val="none"/>
+        </w:rPr>
+        <w:t>EEFs</w:t>
+      </w:r>
+      <w:proofErr w:type="spellEnd"/>
+      <w:r>
+        <w:rPr>
+          <w:rFonts w:ascii="Calibri" w:eastAsia="Times New Roman" w:hAnsi="Calibri" w:cs="Calibri"/>
+          <w:kern w:val="0"/>
+          <w:lang w:eastAsia="es-CL"/>
+          <w14:ligatures w14:val="none"/>
+        </w:rPr>
+        <w:t>).</w:t>
       </w:r>
     </w:p>
     <w:p>
@@ -2892,6 +2952,26 @@
     </w:p>
     <w:p>
       <w:pPr>
+        <w:rPr>
+          <w:rFonts w:ascii="Calibri" w:eastAsia="Times New Roman" w:hAnsi="Calibri" w:cs="Calibri"/>
+          <w:b/>
+          <w:bCs/>
+          <w:color w:val="0F4761" w:themeColor="accent1" w:themeShade="BF"/>
+          <w:lang w:eastAsia="es-CL"/>
+        </w:rPr>
+      </w:pPr>
+      <w:r>
+        <w:rPr>
+          <w:rFonts w:ascii="Calibri" w:eastAsia="Times New Roman" w:hAnsi="Calibri" w:cs="Calibri"/>
+          <w:b/>
+          <w:bCs/>
+          <w:lang w:eastAsia="es-CL"/>
+        </w:rPr>
+        <w:br w:type="page"/>
+      </w:r>
+    </w:p>
+    <w:p>
+      <w:pPr>
         <w:pStyle w:val="Ttulo2"/>
         <w:spacing w:before="0" w:after="0" w:line="240" w:lineRule="auto"/>
         <w:rPr>
@@ -2912,6 +2992,7 @@
           <w:szCs w:val="22"/>
           <w:lang w:eastAsia="es-CL"/>
         </w:rPr>
+        <w:lastRenderedPageBreak/>
         <w:t>7</w:t>
       </w:r>
       <w:r>
@@ -3081,7 +3162,6 @@
           <w:lang w:eastAsia="es-CL"/>
           <w14:ligatures w14:val="none"/>
         </w:rPr>
-        <w:lastRenderedPageBreak/>
         <w:t>Impacto esperado en los usuarios, organización o comunidad.</w:t>
       </w:r>
     </w:p>
@@ -3801,6 +3881,29 @@
     </w:p>
     <w:p>
       <w:pPr>
+        <w:rPr>
+          <w:rFonts w:ascii="Calibri" w:eastAsia="Times New Roman" w:hAnsi="Calibri" w:cs="Calibri"/>
+          <w:b/>
+          <w:bCs/>
+          <w:kern w:val="0"/>
+          <w:lang w:eastAsia="es-CL"/>
+          <w14:ligatures w14:val="none"/>
+        </w:rPr>
+      </w:pPr>
+      <w:r>
+        <w:rPr>
+          <w:rFonts w:ascii="Calibri" w:eastAsia="Times New Roman" w:hAnsi="Calibri" w:cs="Calibri"/>
+          <w:b/>
+          <w:bCs/>
+          <w:kern w:val="0"/>
+          <w:lang w:eastAsia="es-CL"/>
+          <w14:ligatures w14:val="none"/>
+        </w:rPr>
+        <w:br w:type="page"/>
+      </w:r>
+    </w:p>
+    <w:p>
+      <w:pPr>
         <w:spacing w:before="100" w:beforeAutospacing="1" w:after="100" w:afterAutospacing="1" w:line="240" w:lineRule="auto"/>
         <w:outlineLvl w:val="1"/>
         <w:rPr>
@@ -3821,29 +3924,8 @@
           <w:lang w:eastAsia="es-CL"/>
           <w14:ligatures w14:val="none"/>
         </w:rPr>
-        <w:t>8.</w:t>
-      </w:r>
-      <w:r>
-        <w:rPr>
-          <w:rFonts w:ascii="Calibri" w:eastAsia="Times New Roman" w:hAnsi="Calibri" w:cs="Calibri"/>
-          <w:b/>
-          <w:bCs/>
-          <w:kern w:val="0"/>
-          <w:lang w:eastAsia="es-CL"/>
-          <w14:ligatures w14:val="none"/>
-        </w:rPr>
-        <w:t>3</w:t>
-      </w:r>
-      <w:r>
-        <w:rPr>
-          <w:rFonts w:ascii="Calibri" w:eastAsia="Times New Roman" w:hAnsi="Calibri" w:cs="Calibri"/>
-          <w:b/>
-          <w:bCs/>
-          <w:kern w:val="0"/>
-          <w:lang w:eastAsia="es-CL"/>
-          <w14:ligatures w14:val="none"/>
-        </w:rPr>
-        <w:t>. Planificación del proyecto</w:t>
+        <w:lastRenderedPageBreak/>
+        <w:t>8.3. Planificación del proyecto</w:t>
       </w:r>
     </w:p>
     <w:p>
@@ -4106,7 +4188,6 @@
           <w:lang w:eastAsia="es-CL"/>
           <w14:ligatures w14:val="none"/>
         </w:rPr>
-        <w:lastRenderedPageBreak/>
         <w:t xml:space="preserve">Dependencias. </w:t>
       </w:r>
     </w:p>
@@ -4824,25 +4905,7 @@
           <w:lang w:eastAsia="es-CL"/>
           <w14:ligatures w14:val="none"/>
         </w:rPr>
-        <w:t>a</w:t>
-      </w:r>
-      <w:r>
-        <w:rPr>
-          <w:rFonts w:ascii="Calibri" w:eastAsia="Times New Roman" w:hAnsi="Calibri" w:cs="Calibri"/>
-          <w:kern w:val="0"/>
-          <w:lang w:eastAsia="es-CL"/>
-          <w14:ligatures w14:val="none"/>
-        </w:rPr>
-        <w:t>portes institucionales</w:t>
-      </w:r>
-      <w:r>
-        <w:rPr>
-          <w:rFonts w:ascii="Calibri" w:eastAsia="Times New Roman" w:hAnsi="Calibri" w:cs="Calibri"/>
-          <w:kern w:val="0"/>
-          <w:lang w:eastAsia="es-CL"/>
-          <w14:ligatures w14:val="none"/>
-        </w:rPr>
-        <w:t xml:space="preserve">, </w:t>
+        <w:t xml:space="preserve">aportes institucionales, </w:t>
       </w:r>
       <w:r>
         <w:rPr>
@@ -5097,6 +5160,7 @@
           <w:lang w:eastAsia="es-CL"/>
           <w14:ligatures w14:val="none"/>
         </w:rPr>
+        <w:lastRenderedPageBreak/>
         <w:t>Egresos operacionales.</w:t>
       </w:r>
     </w:p>
@@ -5317,8 +5381,17 @@
           <w:lang w:eastAsia="es-CL"/>
           <w14:ligatures w14:val="none"/>
         </w:rPr>
-        <w:lastRenderedPageBreak/>
-        <w:t>En proyectos sociales o comunitarios, los ingresos podrán corresponder a aportes institucionales, subvenciones, fondos concursables, donaciones, convenios u otras fuentes que permitan financiar la continuidad del proyecto.</w:t>
+        <w:t xml:space="preserve">En proyectos sociales o comunitarios, los ingresos podrán corresponder a aportes institucionales, subvenciones, fondos concursables, donaciones, convenios u otras fuentes que permitan financiar la continuidad del </w:t>
+      </w:r>
+      <w:proofErr w:type="gramStart"/>
+      <w:r>
+        <w:rPr>
+          <w:rFonts w:ascii="Calibri" w:eastAsia="Times New Roman" w:hAnsi="Calibri" w:cs="Calibri"/>
+          <w:kern w:val="0"/>
+          <w:lang w:eastAsia="es-CL"/>
+          <w14:ligatures w14:val="none"/>
+        </w:rPr>
+        <w:t>proyecto.</w:t>
       </w:r>
       <w:r>
         <w:rPr>
@@ -5329,6 +5402,7 @@
         </w:rPr>
         <w:t>.</w:t>
       </w:r>
+      <w:proofErr w:type="gramEnd"/>
     </w:p>
     <w:p>
       <w:pPr>
@@ -5979,6 +6053,7 @@
           <w:lang w:eastAsia="es-CL"/>
           <w14:ligatures w14:val="none"/>
         </w:rPr>
+        <w:lastRenderedPageBreak/>
         <w:t>Anexo A</w:t>
       </w:r>
     </w:p>
@@ -6071,7 +6146,27 @@
           <w:lang w:eastAsia="es-CL"/>
           <w14:ligatures w14:val="none"/>
         </w:rPr>
-        <w:t xml:space="preserve">Focus group. </w:t>
+        <w:t xml:space="preserve">Focus </w:t>
+      </w:r>
+      <w:proofErr w:type="spellStart"/>
+      <w:r>
+        <w:rPr>
+          <w:rFonts w:ascii="Calibri" w:eastAsia="Times New Roman" w:hAnsi="Calibri" w:cs="Calibri"/>
+          <w:kern w:val="0"/>
+          <w:lang w:eastAsia="es-CL"/>
+          <w14:ligatures w14:val="none"/>
+        </w:rPr>
+        <w:t>group</w:t>
+      </w:r>
+      <w:proofErr w:type="spellEnd"/>
+      <w:r>
+        <w:rPr>
+          <w:rFonts w:ascii="Calibri" w:eastAsia="Times New Roman" w:hAnsi="Calibri" w:cs="Calibri"/>
+          <w:kern w:val="0"/>
+          <w:lang w:eastAsia="es-CL"/>
+          <w14:ligatures w14:val="none"/>
+        </w:rPr>
+        <w:t xml:space="preserve">. </w:t>
       </w:r>
     </w:p>
     <w:p>
@@ -6164,7 +6259,6 @@
           <w:lang w:eastAsia="es-CL"/>
           <w14:ligatures w14:val="none"/>
         </w:rPr>
-        <w:lastRenderedPageBreak/>
         <w:t>Un anexo por integrante.</w:t>
       </w:r>
     </w:p>
@@ -6306,14 +6400,30 @@
           <w:rFonts w:ascii="Calibri" w:eastAsia="Times New Roman" w:hAnsi="Calibri" w:cs="Calibri"/>
           <w:lang w:eastAsia="es-CL"/>
         </w:rPr>
-        <w:t xml:space="preserve">Logrado = 100% </w:t>
-      </w:r>
-      <w:r>
-        <w:rPr>
-          <w:rFonts w:ascii="Calibri" w:eastAsia="Times New Roman" w:hAnsi="Calibri" w:cs="Calibri"/>
-          <w:lang w:eastAsia="es-CL"/>
-        </w:rPr>
-        <w:t xml:space="preserve"> | </w:t>
+        <w:t>Logrado = 100</w:t>
+      </w:r>
+      <w:proofErr w:type="gramStart"/>
+      <w:r>
+        <w:rPr>
+          <w:rFonts w:ascii="Calibri" w:eastAsia="Times New Roman" w:hAnsi="Calibri" w:cs="Calibri"/>
+          <w:lang w:eastAsia="es-CL"/>
+        </w:rPr>
+        <w:t xml:space="preserve">% </w:t>
+      </w:r>
+      <w:r>
+        <w:rPr>
+          <w:rFonts w:ascii="Calibri" w:eastAsia="Times New Roman" w:hAnsi="Calibri" w:cs="Calibri"/>
+          <w:lang w:eastAsia="es-CL"/>
+        </w:rPr>
+        <w:t xml:space="preserve"> |</w:t>
+      </w:r>
+      <w:proofErr w:type="gramEnd"/>
+      <w:r>
+        <w:rPr>
+          <w:rFonts w:ascii="Calibri" w:eastAsia="Times New Roman" w:hAnsi="Calibri" w:cs="Calibri"/>
+          <w:lang w:eastAsia="es-CL"/>
+        </w:rPr>
+        <w:t xml:space="preserve"> </w:t>
       </w:r>
       <w:r>
         <w:rPr>
@@ -6668,7 +6778,23 @@
                 <w:rFonts w:ascii="Calibri" w:eastAsia="Times New Roman" w:hAnsi="Calibri" w:cs="Calibri"/>
                 <w:lang w:eastAsia="es-CL"/>
               </w:rPr>
-              <w:t>Desarrolla adecuadamente el problema, contexto, necesidad identificada, propósito, objetivos y stakeholders del proyecto.</w:t>
+              <w:t xml:space="preserve">Desarrolla adecuadamente el problema, contexto, necesidad identificada, propósito, objetivos y </w:t>
+            </w:r>
+            <w:proofErr w:type="spellStart"/>
+            <w:r>
+              <w:rPr>
+                <w:rFonts w:ascii="Calibri" w:eastAsia="Times New Roman" w:hAnsi="Calibri" w:cs="Calibri"/>
+                <w:lang w:eastAsia="es-CL"/>
+              </w:rPr>
+              <w:t>stakeholders</w:t>
+            </w:r>
+            <w:proofErr w:type="spellEnd"/>
+            <w:r>
+              <w:rPr>
+                <w:rFonts w:ascii="Calibri" w:eastAsia="Times New Roman" w:hAnsi="Calibri" w:cs="Calibri"/>
+                <w:lang w:eastAsia="es-CL"/>
+              </w:rPr>
+              <w:t xml:space="preserve"> del proyecto.</w:t>
             </w:r>
           </w:p>
         </w:tc>
@@ -10890,6 +11016,7 @@
   <w:style w:type="character" w:default="1" w:styleId="Fuentedeprrafopredeter">
     <w:name w:val="Default Paragraph Font"/>
     <w:uiPriority w:val="1"/>
+    <w:semiHidden/>
     <w:unhideWhenUsed/>
   </w:style>
   <w:style w:type="table" w:default="1" w:styleId="Tablanormal">

</xml_diff>